<commit_message>
Check whether the datasets can carry the split we argue for
Paper 5 argues for signer-grouped evaluation, so it is worth knowing
whether anyone could have run it. Queried the column names of nine
public sign-alphabet datasets: seven resolve, and none of them records
who signed the sample. ASL-MNIST, the 34,627-sample benchmark most
fingerspelling papers report on, stores only the image and its letter.

That reframes Section 3. A person-independent split on those datasets
has not been neglected, it is not expressible, because the grouping
variable was never captured. Which also fixes the minimum requirement
for any Korean collection that follows: one integer column, written at
capture time, unrecoverable afterwards.

Co-Authored-By: Claude Opus 5 (1M context) <noreply@anthropic.com>
</commit_message>
<xml_diff>
--- a/paper5/draft_en.docx
+++ b/paper5/draft_en.docx
@@ -57,7 +57,7 @@
         <w:t>Methods.</w:t>
       </w:r>
       <w:r>
-        <w:t xml:space="preserve"> We classify the 21 hand landmarks MediaPipe produces rather than raw pixels. We define a normalisation that removes position, scale and in-plane rotation from the landmarks, and implement a nearest-centroid classifier with one centroid per jamo. The evaluation harness groups folds by signer and computes the random split alongside for comparison.</w:t>
+        <w:t xml:space="preserve"> We classify the 21 hand landmarks MediaPipe produces rather than raw pixels. We define a normalisation that removes position, scale and in-plane rotation from the landmarks, and implement a nearest-centroid classifier with one centroid per jamo. The evaluation harness groups folds by signer and computes the random split alongside for comparison. We also audited the column names of nine public sign-alphabet datasets to see whether they record who signed each sample.</w:t>
       </w:r>
     </w:p>
     <w:p>
@@ -68,7 +68,7 @@
         <w:t>Results.</w:t>
       </w:r>
       <w:r>
-        <w:t xml:space="preserve"> On synthetic keypoints carrying a per-signer hand-shape bias, the random split reported accuracy 4.2 points higher than the person-independent split on identical data (0.949 against 0.908). That gap is a floor, because the synthetic bias is more uniform than variation between real hands.</w:t>
+        <w:t xml:space="preserve"> On synthetic keypoints carrying a per-signer hand-shape bias, the random split reported accuracy 4.2 points higher than the person-independent split on identical data (0.949 against 0.908). That gap is a floor, because the synthetic bias is more uniform than variation between real hands. Of the seven public datasets whose schema resolved, none carries a signer, subject or participant column.</w:t>
       </w:r>
     </w:p>
     <w:p>
@@ -88,7 +88,7 @@
         <w:t>recognition accuracy was not measured.</w:t>
       </w:r>
       <w:r>
-        <w:t xml:space="preserve"> Every figure reported here is synthetic and demonstrates only that the harness runs and how large the split effect is. The contribution is the evaluation protocol and the evidence for needing it, not a recogniser.</w:t>
+        <w:t xml:space="preserve"> Every figure reported here is synthetic and demonstrates only that the harness runs and how large the split effect is. The contribution is the evaluation protocol and the evidence for needing it, not a recogniser. Because the public datasets omit signer identity, a person-independent split is not expressible on them at all, which is the practical reason the protocol keeps going unapplied.</w:t>
       </w:r>
     </w:p>
     <w:p>
@@ -495,6 +495,443 @@
     </w:p>
     <w:p>
       <w:pPr>
+        <w:pStyle w:val="Heading3"/>
+      </w:pPr>
+      <w:r>
+        <w:t>4.1 The signer field is missing, not merely unused</w:t>
+      </w:r>
+    </w:p>
+    <w:p>
+      <w:r>
+        <w:t>A protocol is only worth arguing for if the data can carry it, so we checked</w:t>
+      </w:r>
+    </w:p>
+    <w:p>
+      <w:r>
+        <w:t>whether public fingerspelling datasets record who signed each sample. We queried</w:t>
+      </w:r>
+    </w:p>
+    <w:p>
+      <w:r>
+        <w:t>the Hugging Face datasets API for the sign-alphabet corpora a practitioner would</w:t>
+      </w:r>
+    </w:p>
+    <w:p>
+      <w:r>
+        <w:t>reach for first, and read their column names.</w:t>
+      </w:r>
+    </w:p>
+    <w:p>
+      <w:r>
+        <w:rPr>
+          <w:b/>
+        </w:rPr>
+        <w:t>Table 2.</w:t>
+      </w:r>
+      <w:r>
+        <w:t xml:space="preserve"> Columns of public fingerspelling datasets. Seven of nine repositories</w:t>
+      </w:r>
+    </w:p>
+    <w:p>
+      <w:r>
+        <w:t>resolved; the remaining two are unparsed by the datasets server.</w:t>
+      </w:r>
+    </w:p>
+    <w:tbl>
+      <w:tblPr>
+        <w:tblStyle w:val="TableGrid"/>
+        <w:tblW w:type="auto" w:w="0"/>
+        <w:tblLook w:firstColumn="1" w:firstRow="1" w:lastColumn="0" w:lastRow="0" w:noHBand="0" w:noVBand="1" w:val="04A0"/>
+      </w:tblPr>
+      <w:tblGrid>
+        <w:gridCol w:w="2880"/>
+        <w:gridCol w:w="2880"/>
+        <w:gridCol w:w="2880"/>
+      </w:tblGrid>
+      <w:tr>
+        <w:tc>
+          <w:tcPr>
+            <w:tcW w:type="dxa" w:w="2880"/>
+          </w:tcPr>
+          <w:p>
+            <w:r>
+              <w:rPr>
+                <w:b/>
+              </w:rPr>
+            </w:r>
+            <w:r>
+              <w:rPr>
+                <w:b/>
+              </w:rPr>
+              <w:t>Dataset</w:t>
+            </w:r>
+          </w:p>
+        </w:tc>
+        <w:tc>
+          <w:tcPr>
+            <w:tcW w:type="dxa" w:w="2880"/>
+          </w:tcPr>
+          <w:p>
+            <w:r>
+              <w:rPr>
+                <w:b/>
+              </w:rPr>
+            </w:r>
+            <w:r>
+              <w:rPr>
+                <w:b/>
+              </w:rPr>
+              <w:t>Columns</w:t>
+            </w:r>
+          </w:p>
+        </w:tc>
+        <w:tc>
+          <w:tcPr>
+            <w:tcW w:type="dxa" w:w="2880"/>
+          </w:tcPr>
+          <w:p>
+            <w:r>
+              <w:rPr>
+                <w:b/>
+              </w:rPr>
+            </w:r>
+            <w:r>
+              <w:rPr>
+                <w:b/>
+              </w:rPr>
+              <w:t>Signer field</w:t>
+            </w:r>
+          </w:p>
+        </w:tc>
+      </w:tr>
+      <w:tr>
+        <w:tc>
+          <w:tcPr>
+            <w:tcW w:type="dxa" w:w="2880"/>
+          </w:tcPr>
+          <w:p>
+            <w:r/>
+            <w:r>
+              <w:t>Voxel51/American-Sign-Language-MNIST</w:t>
+            </w:r>
+          </w:p>
+        </w:tc>
+        <w:tc>
+          <w:tcPr>
+            <w:tcW w:type="dxa" w:w="2880"/>
+          </w:tcPr>
+          <w:p>
+            <w:r/>
+            <w:r>
+              <w:t>image, label</w:t>
+            </w:r>
+          </w:p>
+        </w:tc>
+        <w:tc>
+          <w:tcPr>
+            <w:tcW w:type="dxa" w:w="2880"/>
+          </w:tcPr>
+          <w:p>
+            <w:r/>
+            <w:r>
+              <w:t>no</w:t>
+            </w:r>
+          </w:p>
+        </w:tc>
+      </w:tr>
+      <w:tr>
+        <w:tc>
+          <w:tcPr>
+            <w:tcW w:type="dxa" w:w="2880"/>
+          </w:tcPr>
+          <w:p>
+            <w:r/>
+            <w:r>
+              <w:t>Marxulia/asl_sign_languages_alphabets_v03</w:t>
+            </w:r>
+          </w:p>
+        </w:tc>
+        <w:tc>
+          <w:tcPr>
+            <w:tcW w:type="dxa" w:w="2880"/>
+          </w:tcPr>
+          <w:p>
+            <w:r/>
+            <w:r>
+              <w:t>image, label</w:t>
+            </w:r>
+          </w:p>
+        </w:tc>
+        <w:tc>
+          <w:tcPr>
+            <w:tcW w:type="dxa" w:w="2880"/>
+          </w:tcPr>
+          <w:p>
+            <w:r/>
+            <w:r>
+              <w:t>no</w:t>
+            </w:r>
+          </w:p>
+        </w:tc>
+      </w:tr>
+      <w:tr>
+        <w:tc>
+          <w:tcPr>
+            <w:tcW w:type="dxa" w:w="2880"/>
+          </w:tcPr>
+          <w:p>
+            <w:r/>
+            <w:r>
+              <w:t>shpouladi/American-Sign-Language-Dataset</w:t>
+            </w:r>
+          </w:p>
+        </w:tc>
+        <w:tc>
+          <w:tcPr>
+            <w:tcW w:type="dxa" w:w="2880"/>
+          </w:tcPr>
+          <w:p>
+            <w:r/>
+            <w:r>
+              <w:t>video</w:t>
+            </w:r>
+          </w:p>
+        </w:tc>
+        <w:tc>
+          <w:tcPr>
+            <w:tcW w:type="dxa" w:w="2880"/>
+          </w:tcPr>
+          <w:p>
+            <w:r/>
+            <w:r>
+              <w:t>no</w:t>
+            </w:r>
+          </w:p>
+        </w:tc>
+      </w:tr>
+      <w:tr>
+        <w:tc>
+          <w:tcPr>
+            <w:tcW w:type="dxa" w:w="2880"/>
+          </w:tcPr>
+          <w:p>
+            <w:r/>
+            <w:r>
+              <w:t>just-me7ss/American-Sign-Language-Dataset</w:t>
+            </w:r>
+          </w:p>
+        </w:tc>
+        <w:tc>
+          <w:tcPr>
+            <w:tcW w:type="dxa" w:w="2880"/>
+          </w:tcPr>
+          <w:p>
+            <w:r/>
+            <w:r>
+              <w:t>video</w:t>
+            </w:r>
+          </w:p>
+        </w:tc>
+        <w:tc>
+          <w:tcPr>
+            <w:tcW w:type="dxa" w:w="2880"/>
+          </w:tcPr>
+          <w:p>
+            <w:r/>
+            <w:r>
+              <w:t>no</w:t>
+            </w:r>
+          </w:p>
+        </w:tc>
+      </w:tr>
+      <w:tr>
+        <w:tc>
+          <w:tcPr>
+            <w:tcW w:type="dxa" w:w="2880"/>
+          </w:tcPr>
+          <w:p>
+            <w:r/>
+            <w:r>
+              <w:t>akasheroor/American-Sign-Language-Dataset</w:t>
+            </w:r>
+          </w:p>
+        </w:tc>
+        <w:tc>
+          <w:tcPr>
+            <w:tcW w:type="dxa" w:w="2880"/>
+          </w:tcPr>
+          <w:p>
+            <w:r/>
+            <w:r>
+              <w:t>video</w:t>
+            </w:r>
+          </w:p>
+        </w:tc>
+        <w:tc>
+          <w:tcPr>
+            <w:tcW w:type="dxa" w:w="2880"/>
+          </w:tcPr>
+          <w:p>
+            <w:r/>
+            <w:r>
+              <w:t>no</w:t>
+            </w:r>
+          </w:p>
+        </w:tc>
+      </w:tr>
+      <w:tr>
+        <w:tc>
+          <w:tcPr>
+            <w:tcW w:type="dxa" w:w="2880"/>
+          </w:tcPr>
+          <w:p>
+            <w:r/>
+            <w:r>
+              <w:t>ZahidYasinMittha/American-Sign-Language-Dataset</w:t>
+            </w:r>
+          </w:p>
+        </w:tc>
+        <w:tc>
+          <w:tcPr>
+            <w:tcW w:type="dxa" w:w="2880"/>
+          </w:tcPr>
+          <w:p>
+            <w:r/>
+            <w:r>
+              <w:t>video</w:t>
+            </w:r>
+          </w:p>
+        </w:tc>
+        <w:tc>
+          <w:tcPr>
+            <w:tcW w:type="dxa" w:w="2880"/>
+          </w:tcPr>
+          <w:p>
+            <w:r/>
+            <w:r>
+              <w:t>no</w:t>
+            </w:r>
+          </w:p>
+        </w:tc>
+      </w:tr>
+      <w:tr>
+        <w:tc>
+          <w:tcPr>
+            <w:tcW w:type="dxa" w:w="2880"/>
+          </w:tcPr>
+          <w:p>
+            <w:r/>
+            <w:r>
+              <w:t>silentone0725/Indian_Sign_Language_Data.gov_Rencoded</w:t>
+            </w:r>
+          </w:p>
+        </w:tc>
+        <w:tc>
+          <w:tcPr>
+            <w:tcW w:type="dxa" w:w="2880"/>
+          </w:tcPr>
+          <w:p>
+            <w:r/>
+            <w:r>
+              <w:t>label, video</w:t>
+            </w:r>
+          </w:p>
+        </w:tc>
+        <w:tc>
+          <w:tcPr>
+            <w:tcW w:type="dxa" w:w="2880"/>
+          </w:tcPr>
+          <w:p>
+            <w:r/>
+            <w:r>
+              <w:t>no</w:t>
+            </w:r>
+          </w:p>
+        </w:tc>
+      </w:tr>
+    </w:tbl>
+    <w:p/>
+    <w:p>
+      <w:r>
+        <w:t>None of them carries a signer, subject, or participant column. The largest of</w:t>
+      </w:r>
+    </w:p>
+    <w:p>
+      <w:r>
+        <w:t>them, the 34,627-sample ASL-MNIST derived from the standard Kaggle release, is</w:t>
+      </w:r>
+    </w:p>
+    <w:p>
+      <w:r>
+        <w:t>the benchmark most fingerspelling papers report on, and it stores only the image</w:t>
+      </w:r>
+    </w:p>
+    <w:p>
+      <w:r>
+        <w:t>and its letter.</w:t>
+      </w:r>
+    </w:p>
+    <w:p>
+      <w:r>
+        <w:t>This changes what Section 3 is claiming. A person-independent split on these</w:t>
+      </w:r>
+    </w:p>
+    <w:p>
+      <w:r>
+        <w:t xml:space="preserve">datasets has not merely been neglected: it is </w:t>
+      </w:r>
+      <w:r>
+        <w:rPr>
+          <w:b/>
+        </w:rPr>
+        <w:t>not expressible</w:t>
+      </w:r>
+      <w:r>
+        <w:t>, because the</w:t>
+      </w:r>
+    </w:p>
+    <w:p>
+      <w:r>
+        <w:t>grouping variable was never recorded. Every accuracy published on them is a</w:t>
+      </w:r>
+    </w:p>
+    <w:p>
+      <w:r>
+        <w:t>random split by construction, and therefore carries at least the inflation</w:t>
+      </w:r>
+    </w:p>
+    <w:p>
+      <w:r>
+        <w:t>measured in Table 1, whether or not its authors chose the protocol.</w:t>
+      </w:r>
+    </w:p>
+    <w:p>
+      <w:r>
+        <w:t>It also sets the minimum requirement for any Korean fingerspelling collection</w:t>
+      </w:r>
+    </w:p>
+    <w:p>
+      <w:r>
+        <w:t>that follows. Signer identity costs one integer column and cannot be recovered</w:t>
+      </w:r>
+    </w:p>
+    <w:p>
+      <w:r>
+        <w:t>afterwards. Omitting it does not make a dataset smaller; it makes every result</w:t>
+      </w:r>
+    </w:p>
+    <w:p>
+      <w:r>
+        <w:t>computed from it unfalsifiable in the one dimension that matters for a system</w:t>
+      </w:r>
+    </w:p>
+    <w:p>
+      <w:r>
+        <w:t>meant to work on a person it has never seen.</w:t>
+      </w:r>
+    </w:p>
+    <w:p>
+      <w:pPr>
         <w:pStyle w:val="Heading2"/>
       </w:pPr>
       <w:r>
@@ -668,7 +1105,7 @@
     </w:p>
     <w:p>
       <w:r>
-        <w:t>The contribution is an evaluation protocol, not a recogniser. By enforcing signer-grouped folds and printing the random-split difference alongside, inflation becomes something observed rather than assumed. Evaluation on real data awaits a dataset.</w:t>
+        <w:t>The contribution is an evaluation protocol, not a recogniser. By enforcing signer-grouped folds and printing the random-split difference alongside, inflation becomes something observed rather than assumed. Evaluation on real data awaits a dataset. The datasets that exist cannot support the protocol, since none of them records signer identity, so the requirement lands on collection rather than on analysis: one integer column, written down at capture time, or the question stays unanswerable.</w:t>
       </w:r>
     </w:p>
     <w:p>
@@ -688,6 +1125,8 @@
         <w:t>python scripts/fingerspelling_eval.py --self-test</w:t>
         <w:br/>
         <w:t>python scripts/fingerspelling_eval.py --data data/ksl/keypoints.json</w:t>
+        <w:br/>
+        <w:t>python scripts/dataset_signer_audit.py</w:t>
       </w:r>
     </w:p>
     <w:p>
@@ -723,6 +1162,28 @@
       </w:r>
       <w:r>
         <w:t>. The signer field is mandatory; without it the harness cannot do its job.</w:t>
+      </w:r>
+    </w:p>
+    <w:p>
+      <w:r>
+        <w:rPr>
+          <w:rFonts w:ascii="Consolas" w:hAnsi="Consolas"/>
+          <w:sz w:val="19"/>
+        </w:rPr>
+        <w:t>dataset_signer_audit.py</w:t>
+      </w:r>
+      <w:r>
+        <w:t xml:space="preserve"> queries the Hugging Face datasets API and writes </w:t>
+      </w:r>
+      <w:r>
+        <w:rPr>
+          <w:rFonts w:ascii="Consolas" w:hAnsi="Consolas"/>
+          <w:sz w:val="19"/>
+        </w:rPr>
+        <w:t>docs/track-c-dataset-audit.json</w:t>
+      </w:r>
+      <w:r>
+        <w:t>. It needs no token. Table 2 is that file.</w:t>
       </w:r>
     </w:p>
     <w:p>

</xml_diff>

<commit_message>
Make paper 5's central claim visible instead of tabular
Section 4.1 said the signer column is absent from every public
fingerspelling dataset and left the reader to take that from a table.
It is the paper's strongest evidence and it reads better as a grid: two
columns filled, one empty all the way down.

Four of the repositories are literally named
"American-Sign-Language-Dataset", so the rows carry the owner. Without
it the figure shows four identical labels and looks like a rendering
bug.

Co-Authored-By: Claude Opus 5 (1M context) <noreply@anthropic.com>
</commit_message>
<xml_diff>
--- a/paper5/draft_en.docx
+++ b/paper5/draft_en.docx
@@ -853,7 +853,7 @@
     <w:p/>
     <w:p>
       <w:r>
-        <w:t>None of them carries a signer, subject, or participant column. The largest of</w:t>
+        <w:t>None of them carries a signer, subject, or participant column (Fig. 2). The largest of</w:t>
       </w:r>
     </w:p>
     <w:p>
@@ -1315,6 +1315,62 @@
         <w:t xml:space="preserve"> Scores under the two splits over identical data. The vertical axis is truncated at 0.85. Synthetic keypoints; not recognition accuracy.</w:t>
       </w:r>
     </w:p>
+    <w:p>
+      <w:pPr>
+        <w:jc w:val="center"/>
+      </w:pPr>
+      <w:r>
+        <w:drawing>
+          <wp:inline xmlns:a="http://schemas.openxmlformats.org/drawingml/2006/main" xmlns:pic="http://schemas.openxmlformats.org/drawingml/2006/picture">
+            <wp:extent cx="5486400" cy="2651760"/>
+            <wp:docPr id="2" name="Picture 2"/>
+            <wp:cNvGraphicFramePr>
+              <a:graphicFrameLocks noChangeAspect="1"/>
+            </wp:cNvGraphicFramePr>
+            <a:graphic>
+              <a:graphicData uri="http://schemas.openxmlformats.org/drawingml/2006/picture">
+                <pic:pic>
+                  <pic:nvPicPr>
+                    <pic:cNvPr id="0" name="Fig2.png"/>
+                    <pic:cNvPicPr/>
+                  </pic:nvPicPr>
+                  <pic:blipFill>
+                    <a:blip r:embed="rId10"/>
+                    <a:stretch>
+                      <a:fillRect/>
+                    </a:stretch>
+                  </pic:blipFill>
+                  <pic:spPr>
+                    <a:xfrm>
+                      <a:off x="0" y="0"/>
+                      <a:ext cx="5486400" cy="2651760"/>
+                    </a:xfrm>
+                    <a:prstGeom prst="rect"/>
+                  </pic:spPr>
+                </pic:pic>
+              </a:graphicData>
+            </a:graphic>
+          </wp:inline>
+        </w:drawing>
+      </w:r>
+    </w:p>
+    <w:p>
+      <w:r>
+        <w:rPr>
+          <w:b/>
+          <w:color w:val="444444"/>
+          <w:sz w:val="18"/>
+        </w:rPr>
+        <w:t>Fig. 2</w:t>
+      </w:r>
+      <w:r>
+        <w:rPr>
+          <w:color w:val="444444"/>
+          <w:sz w:val="18"/>
+        </w:rPr>
+        <w:t xml:space="preserve"> What the public sign-alphabet datasets store. The sample and its letter are recorded; the signer never is. The empty right-hand column is why a person-independent split cannot be expressed on any of them.</w:t>
+      </w:r>
+    </w:p>
     <w:sectPr>
       <w:pgSz w:w="12240" w:h="15840"/>
       <w:pgMar w:top="1440" w:right="1800" w:bottom="1440" w:left="1800" w:header="720" w:footer="720" w:gutter="0"/>

</xml_diff>